<commit_message>
Manual: AutoCAD-style PDFs, drawing from a model by mesh
Co-Authored-By: Claude Opus 5.5 <noreply@anthropic.com>
Claude-Session: https://claude.ai/code/session_018CFztNkUY3ojhNe98wbeto
</commit_message>
<xml_diff>
--- a/kompas_ai_plugin/docs/KOMPAS-AI_Руководство.docx
+++ b/kompas_ai_plugin/docs/KOMPAS-AI_Руководство.docx
@@ -1767,6 +1767,131 @@
     </w:p>
     <w:p>
       <w:pPr>
+        <w:spacing w:after="120" w:line="300"/>
+      </w:pPr>
+      <w:r>
+        <w:rPr>
+          <w:rFonts w:ascii="Calibri" w:cs="Calibri" w:eastAsia="Calibri" w:hAnsi="Calibri"/>
+          <w:sz w:val="22"/>
+          <w:szCs w:val="22"/>
+        </w:rPr>
+        <w:t xml:space="preserve">PDF из AutoCAD и похожих программ рисуют линии иначе, чем КОМПАС. Программа приводит их к обычному виду сама:</w:t>
+      </w:r>
+    </w:p>
+    <w:p>
+      <w:pPr>
+        <w:pStyle w:val="ListParagraph"/>
+        <w:numPr>
+          <w:ilvl w:val="0"/>
+          <w:numId w:val="2"/>
+        </w:numPr>
+        <w:spacing w:after="60" w:line="288"/>
+      </w:pPr>
+      <w:r>
+        <w:rPr>
+          <w:rFonts w:ascii="Calibri" w:cs="Calibri" w:eastAsia="Calibri" w:hAnsi="Calibri"/>
+          <w:b/>
+          <w:bCs/>
+          <w:sz w:val="22"/>
+          <w:szCs w:val="22"/>
+        </w:rPr>
+        <w:t xml:space="preserve">Линия — залитая полоса</w:t>
+      </w:r>
+      <w:r>
+        <w:rPr>
+          <w:rFonts w:ascii="Calibri" w:cs="Calibri" w:eastAsia="Calibri" w:hAnsi="Calibri"/>
+          <w:sz w:val="22"/>
+          <w:szCs w:val="22"/>
+        </w:rPr>
+        <w:t xml:space="preserve"> (полилиния с шириной, печать весов линий): полоса заменяется одной линией её толщины.</w:t>
+      </w:r>
+    </w:p>
+    <w:p>
+      <w:pPr>
+        <w:pStyle w:val="ListParagraph"/>
+        <w:numPr>
+          <w:ilvl w:val="0"/>
+          <w:numId w:val="2"/>
+        </w:numPr>
+        <w:spacing w:after="60" w:line="288"/>
+      </w:pPr>
+      <w:r>
+        <w:rPr>
+          <w:rFonts w:ascii="Calibri" w:cs="Calibri" w:eastAsia="Calibri" w:hAnsi="Calibri"/>
+          <w:b/>
+          <w:bCs/>
+          <w:sz w:val="22"/>
+          <w:szCs w:val="22"/>
+        </w:rPr>
+        <w:t xml:space="preserve">Линия — контур полосы или пучок тонких линий</w:t>
+      </w:r>
+      <w:r>
+        <w:rPr>
+          <w:rFonts w:ascii="Calibri" w:cs="Calibri" w:eastAsia="Calibri" w:hAnsi="Calibri"/>
+          <w:sz w:val="22"/>
+          <w:szCs w:val="22"/>
+        </w:rPr>
+        <w:t xml:space="preserve">: параллельные края сливаются в одну линию по центру.</w:t>
+      </w:r>
+    </w:p>
+    <w:p>
+      <w:pPr>
+        <w:pStyle w:val="ListParagraph"/>
+        <w:numPr>
+          <w:ilvl w:val="0"/>
+          <w:numId w:val="2"/>
+        </w:numPr>
+        <w:spacing w:after="60" w:line="288"/>
+      </w:pPr>
+      <w:r>
+        <w:rPr>
+          <w:rFonts w:ascii="Calibri" w:cs="Calibri" w:eastAsia="Calibri" w:hAnsi="Calibri"/>
+          <w:b/>
+          <w:bCs/>
+          <w:sz w:val="22"/>
+          <w:szCs w:val="22"/>
+        </w:rPr>
+        <w:t xml:space="preserve">Все линии одной толщины</w:t>
+      </w:r>
+      <w:r>
+        <w:rPr>
+          <w:rFonts w:ascii="Calibri" w:cs="Calibri" w:eastAsia="Calibri" w:hAnsi="Calibri"/>
+          <w:sz w:val="22"/>
+          <w:szCs w:val="22"/>
+        </w:rPr>
+        <w:t xml:space="preserve"> (печать без весов линий): основные и тонкие линии определяются по назначению — размерные и выносные (по стрелкам), штриховые и штрихпунктирные (по разрывам), штриховка (параллельные линии с равным шагом), центровые (через центр окружности). Остальное — контур. В журнале будет предупреждение — проверьте контур.</w:t>
+      </w:r>
+    </w:p>
+    <w:p>
+      <w:pPr>
+        <w:pStyle w:val="ListParagraph"/>
+        <w:numPr>
+          <w:ilvl w:val="0"/>
+          <w:numId w:val="2"/>
+        </w:numPr>
+        <w:spacing w:after="60" w:line="288"/>
+      </w:pPr>
+      <w:r>
+        <w:rPr>
+          <w:rFonts w:ascii="Calibri" w:cs="Calibri" w:eastAsia="Calibri" w:hAnsi="Calibri"/>
+          <w:b/>
+          <w:bCs/>
+          <w:sz w:val="22"/>
+          <w:szCs w:val="22"/>
+        </w:rPr>
+        <w:t xml:space="preserve">Дуги из хорд и линии из кусков</w:t>
+      </w:r>
+      <w:r>
+        <w:rPr>
+          <w:rFonts w:ascii="Calibri" w:cs="Calibri" w:eastAsia="Calibri" w:hAnsi="Calibri"/>
+          <w:sz w:val="22"/>
+          <w:szCs w:val="22"/>
+        </w:rPr>
+        <w:t xml:space="preserve"> собираются в дуги и цельные отрезки.</w:t>
+      </w:r>
+    </w:p>
+    <w:p>
+      <w:pPr>
         <w:pStyle w:val="Heading2"/>
         <w:spacing w:after="120" w:before="240"/>
       </w:pPr>
@@ -4157,7 +4282,7 @@
           <w:sz w:val="22"/>
           <w:szCs w:val="22"/>
         </w:rPr>
-        <w:t xml:space="preserve">На листе появятся виды спереди, сверху, слева и изометрия, связанные с моделью; невидимые линии — штриховые.</w:t>
+        <w:t xml:space="preserve">КОМПАС сохраняет деталь во временный файл STL (сетка треугольников), и программа сама строит по ней виды: главный, сверху, слева и изометрию. Видимые рёбра и очерки цилиндров — основной линией, невидимые — штриховой, у тел вращения — осевая линия (вид сверху для них не строится — он совпадает с главным), у отверстий — центровые линии.</w:t>
       </w:r>
     </w:p>
     <w:p>
@@ -4175,6 +4300,24 @@
           <w:sz w:val="22"/>
           <w:szCs w:val="22"/>
         </w:rPr>
+        <w:t xml:space="preserve">Виды рисуются обычными отрезками, дугами и окружностями — так же, как чертёж из PDF, поэтому лист не бывает пустым. Эти виды не связаны с моделью: изменили деталь — постройте чертёж заново.</w:t>
+      </w:r>
+    </w:p>
+    <w:p>
+      <w:pPr>
+        <w:pStyle w:val="ListParagraph"/>
+        <w:numPr>
+          <w:ilvl w:val="0"/>
+          <w:numId w:val="3"/>
+        </w:numPr>
+        <w:spacing w:after="60" w:line="288"/>
+      </w:pPr>
+      <w:r>
+        <w:rPr>
+          <w:rFonts w:ascii="Calibri" w:cs="Calibri" w:eastAsia="Calibri" w:hAnsi="Calibri"/>
+          <w:sz w:val="22"/>
+          <w:szCs w:val="22"/>
+        </w:rPr>
         <w:t xml:space="preserve">Размеры на эти виды ставятся в КОМПАС (команда «Авторазмер» или вручную).</w:t>
       </w:r>
     </w:p>
@@ -4195,15 +4338,15 @@
           <w:sz w:val="22"/>
           <w:szCs w:val="22"/>
         </w:rPr>
-        <w:t xml:space="preserve">Если лист пустой. </w:t>
-      </w:r>
-      <w:r>
-        <w:rPr>
-          <w:rFonts w:ascii="Calibri" w:cs="Calibri" w:eastAsia="Calibri" w:hAnsi="Calibri"/>
-          <w:sz w:val="22"/>
-          <w:szCs w:val="22"/>
-        </w:rPr>
-        <w:t xml:space="preserve">В журнале у каждого вида написано, создан ли он и каким способом. Пришлите разработчику файл журнала (кнопка «Папка журналов») и отчёт «Проверить КОМПАС» — по ним видно, что ответил КОМПАС.</w:t>
+        <w:t xml:space="preserve">Если КОМПАС не сохранил STL. </w:t>
+      </w:r>
+      <w:r>
+        <w:rPr>
+          <w:rFonts w:ascii="Calibri" w:cs="Calibri" w:eastAsia="Calibri" w:hAnsi="Calibri"/>
+          <w:sz w:val="22"/>
+          <w:szCs w:val="22"/>
+        </w:rPr>
+        <w:t xml:space="preserve">Тогда программа пробует виды, связанные с моделью (средствами КОМПАС). Если и они пустые — пришлите журнал (кнопка «Папка журналов») и отчёт «Проверить КОМПАС»: в журнале записано, какие способы пробовались и что ответил КОМПАС.</w:t>
       </w:r>
     </w:p>
     <w:p>

</xml_diff>

<commit_message>
Sizes without a dimension line: ask, attach, click to edit
A number with arrows around it but no dimension line was kept as text and
silently not held. Each now gets what it may measure (a circle or arc of
its size, two parallel lines or a line as far apart or as long as it
says, nearest first): a question card in every layout and a row with a
choice in the sizes table. The choice makes a real dimension on the next
recognition, before the outline is fitted, so it holds like any other.
A click on a size on the sheet opens its row in the sizes table.

Co-Authored-By: Claude Opus 5.5 <noreply@anthropic.com>
Claude-Session: https://claude.ai/code/session_018CFztNkUY3ojhNe98wbeto
</commit_message>
<xml_diff>
--- a/kompas_ai_plugin/docs/KOMPAS-AI_Руководство.docx
+++ b/kompas_ai_plugin/docs/KOMPAS-AI_Руководство.docx
@@ -3370,6 +3370,125 @@
           <w:szCs w:val="22"/>
         </w:rPr>
         <w:t xml:space="preserve">Размеры, которые не удалось выдержать, показаны отдельно — карточками в виде «Мастер» и списком в виде «Инженер». У каждой карточки три действия: «По линиям» (принять намеренное значение), «Своё число…» (открыть таблицу на этом размере) и «Показать» (найти размер на листе).</w:t>
+      </w:r>
+    </w:p>
+    <w:p>
+      <w:pPr>
+        <w:pStyle w:val="Heading2"/>
+        <w:spacing w:after="120" w:before="240"/>
+      </w:pPr>
+      <w:r>
+        <w:rPr>
+          <w:rFonts w:ascii="Calibri" w:cs="Calibri" w:eastAsia="Calibri" w:hAnsi="Calibri"/>
+        </w:rPr>
+        <w:t xml:space="preserve">7.2. Размеры без размерной линии</w:t>
+      </w:r>
+    </w:p>
+    <w:p>
+      <w:pPr>
+        <w:spacing w:after="120" w:line="300"/>
+      </w:pPr>
+      <w:r>
+        <w:rPr>
+          <w:rFonts w:ascii="Calibri" w:cs="Calibri" w:eastAsia="Calibri" w:hAnsi="Calibri"/>
+          <w:sz w:val="22"/>
+          <w:szCs w:val="22"/>
+        </w:rPr>
+        <w:t xml:space="preserve">Иногда число размера на чертеже есть, а его размерную линию программа не нашла (например, в PDF из AutoCAD). Раньше такое число оставалось просто текстом и размер молча не выдерживался. Теперь программа спрашивает о каждом таком числе:</w:t>
+      </w:r>
+    </w:p>
+    <w:p>
+      <w:pPr>
+        <w:pStyle w:val="ListParagraph"/>
+        <w:numPr>
+          <w:ilvl w:val="0"/>
+          <w:numId w:val="2"/>
+        </w:numPr>
+        <w:spacing w:after="60" w:line="288"/>
+      </w:pPr>
+      <w:r>
+        <w:rPr>
+          <w:rFonts w:ascii="Calibri" w:cs="Calibri" w:eastAsia="Calibri" w:hAnsi="Calibri"/>
+          <w:b/>
+          <w:bCs/>
+          <w:sz w:val="22"/>
+          <w:szCs w:val="22"/>
+        </w:rPr>
+        <w:t xml:space="preserve">В «Вопросах перед построением»</w:t>
+      </w:r>
+      <w:r>
+        <w:rPr>
+          <w:rFonts w:ascii="Calibri" w:cs="Calibri" w:eastAsia="Calibri" w:hAnsi="Calibri"/>
+          <w:sz w:val="22"/>
+          <w:szCs w:val="22"/>
+        </w:rPr>
+        <w:t xml:space="preserve"> — карточка «Ø23-0,2 — размер без размерной линии» с подходящими вариантами: окружность или дуга нужного диаметра, две параллельные линии на нужном расстоянии, линия нужной длины (сначала те, что совпадают по размеру и ближе к числу). Кнопка варианта привязывает размер, «Это текст» — оставляет надпись, «Другое…» открывает таблицу со всеми вариантами.</w:t>
+      </w:r>
+    </w:p>
+    <w:p>
+      <w:pPr>
+        <w:pStyle w:val="ListParagraph"/>
+        <w:numPr>
+          <w:ilvl w:val="0"/>
+          <w:numId w:val="2"/>
+        </w:numPr>
+        <w:spacing w:after="60" w:line="288"/>
+      </w:pPr>
+      <w:r>
+        <w:rPr>
+          <w:rFonts w:ascii="Calibri" w:cs="Calibri" w:eastAsia="Calibri" w:hAnsi="Calibri"/>
+          <w:b/>
+          <w:bCs/>
+          <w:sz w:val="22"/>
+          <w:szCs w:val="22"/>
+        </w:rPr>
+        <w:t xml:space="preserve">В таблице «Все размеры…»</w:t>
+      </w:r>
+      <w:r>
+        <w:rPr>
+          <w:rFonts w:ascii="Calibri" w:cs="Calibri" w:eastAsia="Calibri" w:hAnsi="Calibri"/>
+          <w:sz w:val="22"/>
+          <w:szCs w:val="22"/>
+        </w:rPr>
+        <w:t xml:space="preserve"> — такие числа идут в конце таблицы со списком вариантов в столбце «Значение».</w:t>
+      </w:r>
+    </w:p>
+    <w:p>
+      <w:pPr>
+        <w:spacing w:after="120" w:line="300"/>
+      </w:pPr>
+      <w:r>
+        <w:rPr>
+          <w:rFonts w:ascii="Calibri" w:cs="Calibri" w:eastAsia="Calibri" w:hAnsi="Calibri"/>
+          <w:sz w:val="22"/>
+          <w:szCs w:val="22"/>
+        </w:rPr>
+        <w:t xml:space="preserve">После выбора чертёж распознаётся заново: из числа получается настоящий размер, и контур подгоняется под него, как под любой другой размер.</w:t>
+      </w:r>
+    </w:p>
+    <w:p>
+      <w:pPr>
+        <w:pStyle w:val="Heading2"/>
+        <w:spacing w:after="120" w:before="240"/>
+      </w:pPr>
+      <w:r>
+        <w:rPr>
+          <w:rFonts w:ascii="Calibri" w:cs="Calibri" w:eastAsia="Calibri" w:hAnsi="Calibri"/>
+        </w:rPr>
+        <w:t xml:space="preserve">7.3. Щелчок по размеру на листе</w:t>
+      </w:r>
+    </w:p>
+    <w:p>
+      <w:pPr>
+        <w:spacing w:after="120" w:line="300"/>
+      </w:pPr>
+      <w:r>
+        <w:rPr>
+          <w:rFonts w:ascii="Calibri" w:cs="Calibri" w:eastAsia="Calibri" w:hAnsi="Calibri"/>
+          <w:sz w:val="22"/>
+          <w:szCs w:val="22"/>
+        </w:rPr>
+        <w:t xml:space="preserve">На картинке листа можно просто щёлкнуть по числу размера (или по числу без размерной линии) — откроется таблица «Уточнить размеры» на этой строке. Перетаскивание листа и колесо мыши работают как раньше.</w:t>
       </w:r>
     </w:p>
     <w:p>

</xml_diff>

<commit_message>
Manual: tolerances, roughness, AutoCAD sketches
Co-Authored-By: Claude Opus 5.5 <noreply@anthropic.com>
Claude-Session: https://claude.ai/code/session_018CFztNkUY3ojhNe98wbeto
</commit_message>
<xml_diff>
--- a/kompas_ai_plugin/docs/KOMPAS-AI_Руководство.docx
+++ b/kompas_ai_plugin/docs/KOMPAS-AI_Руководство.docx
@@ -1892,6 +1892,90 @@
     </w:p>
     <w:p>
       <w:pPr>
+        <w:pStyle w:val="ListParagraph"/>
+        <w:numPr>
+          <w:ilvl w:val="0"/>
+          <w:numId w:val="2"/>
+        </w:numPr>
+        <w:spacing w:after="60" w:line="288"/>
+      </w:pPr>
+      <w:r>
+        <w:rPr>
+          <w:rFonts w:ascii="Calibri" w:cs="Calibri" w:eastAsia="Calibri" w:hAnsi="Calibri"/>
+          <w:b/>
+          <w:bCs/>
+          <w:sz w:val="22"/>
+          <w:szCs w:val="22"/>
+        </w:rPr>
+        <w:t xml:space="preserve">Ось сплошной линией</w:t>
+      </w:r>
+      <w:r>
+        <w:rPr>
+          <w:rFonts w:ascii="Calibri" w:cs="Calibri" w:eastAsia="Calibri" w:hAnsi="Calibri"/>
+          <w:sz w:val="22"/>
+          <w:szCs w:val="22"/>
+        </w:rPr>
+        <w:t xml:space="preserve"> — находится по симметрии контура; короткие «ступенчатые» стрелки AutoCAD распознаются.</w:t>
+      </w:r>
+    </w:p>
+    <w:p>
+      <w:pPr>
+        <w:pStyle w:val="ListParagraph"/>
+        <w:numPr>
+          <w:ilvl w:val="0"/>
+          <w:numId w:val="2"/>
+        </w:numPr>
+        <w:spacing w:after="60" w:line="288"/>
+      </w:pPr>
+      <w:r>
+        <w:rPr>
+          <w:rFonts w:ascii="Calibri" w:cs="Calibri" w:eastAsia="Calibri" w:hAnsi="Calibri"/>
+          <w:b/>
+          <w:bCs/>
+          <w:sz w:val="22"/>
+          <w:szCs w:val="22"/>
+        </w:rPr>
+        <w:t xml:space="preserve">Эскиз без рамки</w:t>
+      </w:r>
+      <w:r>
+        <w:rPr>
+          <w:rFonts w:ascii="Calibri" w:cs="Calibri" w:eastAsia="Calibri" w:hAnsi="Calibri"/>
+          <w:sz w:val="22"/>
+          <w:szCs w:val="22"/>
+        </w:rPr>
+        <w:t xml:space="preserve"> (эскиз операции, вырезка из листа) ставится в середину листа подходящего формата. Если текст на нём мельче 2,5 мм, чертёж увеличивается (2:1, 2,5:1 или 4:1), чтобы размеры КОМПАС (3,5 мм) не налезали друг на друга.</w:t>
+      </w:r>
+    </w:p>
+    <w:p>
+      <w:pPr>
+        <w:pStyle w:val="ListParagraph"/>
+        <w:numPr>
+          <w:ilvl w:val="0"/>
+          <w:numId w:val="2"/>
+        </w:numPr>
+        <w:spacing w:after="60" w:line="288"/>
+      </w:pPr>
+      <w:r>
+        <w:rPr>
+          <w:rFonts w:ascii="Calibri" w:cs="Calibri" w:eastAsia="Calibri" w:hAnsi="Calibri"/>
+          <w:b/>
+          <w:bCs/>
+          <w:sz w:val="22"/>
+          <w:szCs w:val="22"/>
+        </w:rPr>
+        <w:t xml:space="preserve">Отверстие в незаштрихованном виде</w:t>
+      </w:r>
+      <w:r>
+        <w:rPr>
+          <w:rFonts w:ascii="Calibri" w:cs="Calibri" w:eastAsia="Calibri" w:hAnsi="Calibri"/>
+          <w:sz w:val="22"/>
+          <w:szCs w:val="22"/>
+        </w:rPr>
+        <w:t xml:space="preserve"> — внутренняя область с конусом от сверла на оси считается отверстием, а не материалом модели.</w:t>
+      </w:r>
+    </w:p>
+    <w:p>
+      <w:pPr>
         <w:pStyle w:val="Heading2"/>
         <w:spacing w:after="120" w:before="240"/>
       </w:pPr>
@@ -3236,6 +3320,144 @@
           </w:p>
         </w:tc>
       </w:tr>
+      <w:tr>
+        <w:trPr>
+          <w:tblHeader w:val="false"/>
+        </w:trPr>
+        <w:tc>
+          <w:tcPr>
+            <w:tcW w:type="dxa" w:w="2200"/>
+            <w:tcBorders>
+              <w:top w:val="single" w:color="C9D1DC" w:sz="4"/>
+              <w:left w:val="single" w:color="C9D1DC" w:sz="4"/>
+              <w:bottom w:val="single" w:color="C9D1DC" w:sz="4"/>
+              <w:right w:val="single" w:color="C9D1DC" w:sz="4"/>
+            </w:tcBorders>
+            <w:tcMar>
+              <w:top w:type="dxa" w:w="70"/>
+              <w:left w:type="dxa" w:w="110"/>
+              <w:bottom w:type="dxa" w:w="70"/>
+              <w:right w:type="dxa" w:w="110"/>
+            </w:tcMar>
+          </w:tcPr>
+          <w:p>
+            <w:pPr>
+              <w:spacing w:after="0" w:line="264"/>
+            </w:pPr>
+            <w:r>
+              <w:rPr>
+                <w:rFonts w:ascii="Calibri" w:cs="Calibri" w:eastAsia="Calibri" w:hAnsi="Calibri"/>
+                <w:b w:val="false"/>
+                <w:bCs w:val="false"/>
+                <w:sz w:val="20"/>
+                <w:szCs w:val="20"/>
+              </w:rPr>
+              <w:t xml:space="preserve">Допуск</w:t>
+            </w:r>
+          </w:p>
+        </w:tc>
+        <w:tc>
+          <w:tcPr>
+            <w:tcW w:type="dxa" w:w="6800"/>
+            <w:tcBorders>
+              <w:top w:val="single" w:color="C9D1DC" w:sz="4"/>
+              <w:left w:val="single" w:color="C9D1DC" w:sz="4"/>
+              <w:bottom w:val="single" w:color="C9D1DC" w:sz="4"/>
+              <w:right w:val="single" w:color="C9D1DC" w:sz="4"/>
+            </w:tcBorders>
+            <w:tcMar>
+              <w:top w:type="dxa" w:w="70"/>
+              <w:left w:type="dxa" w:w="110"/>
+              <w:bottom w:type="dxa" w:w="70"/>
+              <w:right w:type="dxa" w:w="110"/>
+            </w:tcMar>
+          </w:tcPr>
+          <w:p>
+            <w:pPr>
+              <w:spacing w:after="0" w:line="264"/>
+            </w:pPr>
+            <w:r>
+              <w:rPr>
+                <w:rFonts w:ascii="Calibri" w:cs="Calibri" w:eastAsia="Calibri" w:hAnsi="Calibri"/>
+                <w:b w:val="false"/>
+                <w:bCs w:val="false"/>
+                <w:sz w:val="20"/>
+                <w:szCs w:val="20"/>
+              </w:rPr>
+              <w:t xml:space="preserve">Отклонения или поле допуска: ±0,1; -0,2; +0,3; +0,2/-0,1; h12, H7, js9. Можно изменить — новый допуск попадёт в размер на чертеже КОМПАС</w:t>
+            </w:r>
+          </w:p>
+        </w:tc>
+      </w:tr>
+      <w:tr>
+        <w:trPr>
+          <w:tblHeader w:val="false"/>
+        </w:trPr>
+        <w:tc>
+          <w:tcPr>
+            <w:tcW w:type="dxa" w:w="2200"/>
+            <w:tcBorders>
+              <w:top w:val="single" w:color="C9D1DC" w:sz="4"/>
+              <w:left w:val="single" w:color="C9D1DC" w:sz="4"/>
+              <w:bottom w:val="single" w:color="C9D1DC" w:sz="4"/>
+              <w:right w:val="single" w:color="C9D1DC" w:sz="4"/>
+            </w:tcBorders>
+            <w:tcMar>
+              <w:top w:type="dxa" w:w="70"/>
+              <w:left w:type="dxa" w:w="110"/>
+              <w:bottom w:type="dxa" w:w="70"/>
+              <w:right w:type="dxa" w:w="110"/>
+            </w:tcMar>
+          </w:tcPr>
+          <w:p>
+            <w:pPr>
+              <w:spacing w:after="0" w:line="264"/>
+            </w:pPr>
+            <w:r>
+              <w:rPr>
+                <w:rFonts w:ascii="Calibri" w:cs="Calibri" w:eastAsia="Calibri" w:hAnsi="Calibri"/>
+                <w:b w:val="false"/>
+                <w:bCs w:val="false"/>
+                <w:sz w:val="20"/>
+                <w:szCs w:val="20"/>
+              </w:rPr>
+              <w:t xml:space="preserve">Пределы</w:t>
+            </w:r>
+          </w:p>
+        </w:tc>
+        <w:tc>
+          <w:tcPr>
+            <w:tcW w:type="dxa" w:w="6800"/>
+            <w:tcBorders>
+              <w:top w:val="single" w:color="C9D1DC" w:sz="4"/>
+              <w:left w:val="single" w:color="C9D1DC" w:sz="4"/>
+              <w:bottom w:val="single" w:color="C9D1DC" w:sz="4"/>
+              <w:right w:val="single" w:color="C9D1DC" w:sz="4"/>
+            </w:tcBorders>
+            <w:tcMar>
+              <w:top w:type="dxa" w:w="70"/>
+              <w:left w:type="dxa" w:w="110"/>
+              <w:bottom w:type="dxa" w:w="70"/>
+              <w:right w:type="dxa" w:w="110"/>
+            </w:tcMar>
+          </w:tcPr>
+          <w:p>
+            <w:pPr>
+              <w:spacing w:after="0" w:line="264"/>
+            </w:pPr>
+            <w:r>
+              <w:rPr>
+                <w:rFonts w:ascii="Calibri" w:cs="Calibri" w:eastAsia="Calibri" w:hAnsi="Calibri"/>
+                <w:b w:val="false"/>
+                <w:bCs w:val="false"/>
+                <w:sz w:val="20"/>
+                <w:szCs w:val="20"/>
+              </w:rPr>
+              <w:t xml:space="preserve">Наименьший и наибольший размер (для полей H, h, JS, js — по ГОСТ 25346 / ISO 286). Пересчитываются сразу при вводе</w:t>
+            </w:r>
+          </w:p>
+        </w:tc>
+      </w:tr>
     </w:tbl>
     <w:p>
       <w:pPr>
@@ -3295,6 +3517,34 @@
           <w:sz w:val="22"/>
           <w:szCs w:val="22"/>
         </w:rPr>
+        <w:t xml:space="preserve">Середина допуска</w:t>
+      </w:r>
+      <w:r>
+        <w:rPr>
+          <w:rFonts w:ascii="Calibri" w:cs="Calibri" w:eastAsia="Calibri" w:hAnsi="Calibri"/>
+          <w:sz w:val="22"/>
+          <w:szCs w:val="22"/>
+        </w:rPr>
+        <w:t xml:space="preserve"> — построить выбранные размеры по середине поля допуска (так деталь изготавливают): Ø23-0,2 станет 22,9.</w:t>
+      </w:r>
+    </w:p>
+    <w:p>
+      <w:pPr>
+        <w:pStyle w:val="ListParagraph"/>
+        <w:numPr>
+          <w:ilvl w:val="0"/>
+          <w:numId w:val="2"/>
+        </w:numPr>
+        <w:spacing w:after="60" w:line="288"/>
+      </w:pPr>
+      <w:r>
+        <w:rPr>
+          <w:rFonts w:ascii="Calibri" w:cs="Calibri" w:eastAsia="Calibri" w:hAnsi="Calibri"/>
+          <w:b/>
+          <w:bCs/>
+          <w:sz w:val="22"/>
+          <w:szCs w:val="22"/>
+        </w:rPr>
         <w:t xml:space="preserve">Как на чертеже</w:t>
       </w:r>
       <w:r>
@@ -3303,7 +3553,20 @@
           <w:sz w:val="22"/>
           <w:szCs w:val="22"/>
         </w:rPr>
-        <w:t xml:space="preserve"> — вернуть выбранным размерам числа с чертежа.</w:t>
+        <w:t xml:space="preserve"> — вернуть выбранным размерам числа и допуски с чертежа.</w:t>
+      </w:r>
+    </w:p>
+    <w:p>
+      <w:pPr>
+        <w:spacing w:after="120" w:line="300"/>
+      </w:pPr>
+      <w:r>
+        <w:rPr>
+          <w:rFonts w:ascii="Calibri" w:cs="Calibri" w:eastAsia="Calibri" w:hAnsi="Calibri"/>
+          <w:sz w:val="22"/>
+          <w:szCs w:val="22"/>
+        </w:rPr>
+        <w:t xml:space="preserve">Под таблицей — «Шероховатость поверхностей»: все знаки вида Ra 3,2 или Rz 20 (√) с листа. Значение можно изменить; знак со скобками «(√)» — шероховатость остальных поверхностей. В КОМПАС они переносятся надписями.</w:t>
       </w:r>
     </w:p>
     <w:p>
@@ -4401,7 +4664,7 @@
           <w:sz w:val="22"/>
           <w:szCs w:val="22"/>
         </w:rPr>
-        <w:t xml:space="preserve">КОМПАС сохраняет деталь во временный файл STL (сетка треугольников), и программа сама строит по ней виды: главный, сверху, слева и изометрию. Видимые рёбра и очерки цилиндров — основной линией, невидимые — штриховой, у тел вращения — осевая линия (вид сверху для них не строится — он совпадает с главным), у отверстий — центровые линии.</w:t>
+        <w:t xml:space="preserve">КОМПАС сохраняет деталь во временный файл STL (программа перебирает способы сохранения, которые бывают в разных версиях КОМПАС, и проверяет, что получился именно STL), и программа сама строит по ней виды: главный, сверху, слева и изометрию. Видимые рёбра и очерки цилиндров — основной линией, невидимые — штриховой, у тел вращения — осевая линия (вид сверху для них не строится — он совпадает с главным), у отверстий — центровые линии.</w:t>
       </w:r>
     </w:p>
     <w:p>

</xml_diff>

<commit_message>
«Спросить ИИ»: a local model (Ollama) suggests where the drawing is unclear
The sheet as an image and what was recognised go to a model of the user's
Ollama; it answers which object each number without a dimension line
measures (only among the candidates found), which of two contradicting
sizes to trust, what kind of part it is, and notes. Its answer is checked
against the drawing, shown as a list to tick, and the ticked choices go to
the next recognition like the user's own. A free question can be asked.
Standard library only; without Ollama nothing changes.

Co-Authored-By: Claude Opus 5.5 <noreply@anthropic.com>
Claude-Session: https://claude.ai/code/session_018CFztNkUY3ojhNe98wbeto
</commit_message>
<xml_diff>
--- a/kompas_ai_plugin/docs/KOMPAS-AI_Руководство.docx
+++ b/kompas_ai_plugin/docs/KOMPAS-AI_Руководство.docx
@@ -4729,6 +4729,131 @@
           <w:szCs w:val="22"/>
         </w:rPr>
         <w:t xml:space="preserve">Тогда программа пробует виды, связанные с моделью (средствами КОМПАС). Если и они пустые — пришлите журнал (кнопка «Папка журналов») и отчёт «Проверить КОМПАС»: в журнале записано, какие способы пробовались и что ответил КОМПАС.</w:t>
+      </w:r>
+    </w:p>
+    <w:p>
+      <w:pPr>
+        <w:pStyle w:val="Heading2"/>
+        <w:spacing w:after="120" w:before="240"/>
+      </w:pPr>
+      <w:r>
+        <w:rPr>
+          <w:rFonts w:ascii="Calibri" w:cs="Calibri" w:eastAsia="Calibri" w:hAnsi="Calibri"/>
+        </w:rPr>
+        <w:t xml:space="preserve">12.1. Спросить ИИ</w:t>
+      </w:r>
+    </w:p>
+    <w:p>
+      <w:pPr>
+        <w:spacing w:after="120" w:line="300"/>
+      </w:pPr>
+      <w:r>
+        <w:rPr>
+          <w:rFonts w:ascii="Calibri" w:cs="Calibri" w:eastAsia="Calibri" w:hAnsi="Calibri"/>
+          <w:sz w:val="22"/>
+          <w:szCs w:val="22"/>
+        </w:rPr>
+        <w:t xml:space="preserve">Кнопка «ИИ…» над листом (Ctrl+I) подключает бесплатную локальную модель ИИ через программу Ollama. Модель смотрит на изображение листа и на то, что распознала программа, и подсказывает в спорных местах: к чему относятся размеры без размерной линии (выбирая только из найденных программой вариантов), каким из противоречащих размеров верить, что это за деталь, что ещё стоит проверить. Геометрию по-прежнему строит программа — ИИ только советует.</w:t>
+      </w:r>
+    </w:p>
+    <w:p>
+      <w:pPr>
+        <w:pStyle w:val="ListParagraph"/>
+        <w:numPr>
+          <w:ilvl w:val="0"/>
+          <w:numId w:val="3"/>
+        </w:numPr>
+        <w:spacing w:after="60" w:line="288"/>
+      </w:pPr>
+      <w:r>
+        <w:rPr>
+          <w:rFonts w:ascii="Calibri" w:cs="Calibri" w:eastAsia="Calibri" w:hAnsi="Calibri"/>
+          <w:sz w:val="22"/>
+          <w:szCs w:val="22"/>
+        </w:rPr>
+        <w:t xml:space="preserve">Установите Ollama (ollama.com) и один раз скачайте модель, которая понимает картинки: в командной строке «ollama pull qwen2.5vl:7b» (около 6 ГБ) или на слабом компьютере «ollama pull gemma3:4b» (около 3 ГБ).</w:t>
+      </w:r>
+    </w:p>
+    <w:p>
+      <w:pPr>
+        <w:pStyle w:val="ListParagraph"/>
+        <w:numPr>
+          <w:ilvl w:val="0"/>
+          <w:numId w:val="3"/>
+        </w:numPr>
+        <w:spacing w:after="60" w:line="288"/>
+      </w:pPr>
+      <w:r>
+        <w:rPr>
+          <w:rFonts w:ascii="Calibri" w:cs="Calibri" w:eastAsia="Calibri" w:hAnsi="Calibri"/>
+          <w:sz w:val="22"/>
+          <w:szCs w:val="22"/>
+        </w:rPr>
+        <w:t xml:space="preserve">Откройте чертёж и нажмите «ИИ…». В списке «Модель» выберите скачанную модель (программа сама предложит ту, что видит картинки).</w:t>
+      </w:r>
+    </w:p>
+    <w:p>
+      <w:pPr>
+        <w:pStyle w:val="ListParagraph"/>
+        <w:numPr>
+          <w:ilvl w:val="0"/>
+          <w:numId w:val="3"/>
+        </w:numPr>
+        <w:spacing w:after="60" w:line="288"/>
+      </w:pPr>
+      <w:r>
+        <w:rPr>
+          <w:rFonts w:ascii="Calibri" w:cs="Calibri" w:eastAsia="Calibri" w:hAnsi="Calibri"/>
+          <w:sz w:val="22"/>
+          <w:szCs w:val="22"/>
+        </w:rPr>
+        <w:t xml:space="preserve">Нажмите «Проверить чертёж» и подождите: без видеокарты ответ идёт от 20 секунд до нескольких минут.</w:t>
+      </w:r>
+    </w:p>
+    <w:p>
+      <w:pPr>
+        <w:pStyle w:val="ListParagraph"/>
+        <w:numPr>
+          <w:ilvl w:val="0"/>
+          <w:numId w:val="3"/>
+        </w:numPr>
+        <w:spacing w:after="60" w:line="288"/>
+      </w:pPr>
+      <w:r>
+        <w:rPr>
+          <w:rFonts w:ascii="Calibri" w:cs="Calibri" w:eastAsia="Calibri" w:hAnsi="Calibri"/>
+          <w:sz w:val="22"/>
+          <w:szCs w:val="22"/>
+        </w:rPr>
+        <w:t xml:space="preserve">Снимите галочки с подсказок, с которыми не согласны, и нажмите «Применить отмеченное» — чертёж распознается заново с этими решениями. Внизу окна можно задать и свой вопрос о чертеже.</w:t>
+      </w:r>
+    </w:p>
+    <w:p>
+      <w:pPr>
+        <w:pBdr>
+          <w:left w:val="single" w:color="1F5FAD" w:sz="18" w:space="8"/>
+        </w:pBdr>
+        <w:shd w:fill="EEF3FA" w:color="auto" w:val="clear"/>
+        <w:spacing w:after="160" w:before="120" w:line="288"/>
+        <w:ind w:left="200" w:right="200"/>
+      </w:pPr>
+      <w:r>
+        <w:rPr>
+          <w:rFonts w:ascii="Calibri" w:cs="Calibri" w:eastAsia="Calibri" w:hAnsi="Calibri"/>
+          <w:b/>
+          <w:bCs/>
+          <w:sz w:val="22"/>
+          <w:szCs w:val="22"/>
+        </w:rPr>
+        <w:t xml:space="preserve">Если пишет «Ollama не отвечает». </w:t>
+      </w:r>
+      <w:r>
+        <w:rPr>
+          <w:rFonts w:ascii="Calibri" w:cs="Calibri" w:eastAsia="Calibri" w:hAnsi="Calibri"/>
+          <w:sz w:val="22"/>
+          <w:szCs w:val="22"/>
+        </w:rPr>
+        <w:t xml:space="preserve">Запустите Ollama (значок в трее или команда «ollama serve») и нажмите «Обновить». Адрес по умолчанию — http://localhost:11434.</w:t>
       </w:r>
     </w:p>
     <w:p>

</xml_diff>